<commit_message>
Update email app website and drafter
</commit_message>
<xml_diff>
--- a/email_app/templates/microsoft_form_questions.docx
+++ b/email_app/templates/microsoft_form_questions.docx
@@ -2,7 +2,7 @@
 <file path=word/document.xml><?xml version="1.0" encoding="utf-8"?>
 <w:document xmlns:w="http://schemas.openxmlformats.org/wordprocessingml/2006/main" xmlns:m="http://schemas.openxmlformats.org/officeDocument/2006/math" xmlns:r="http://schemas.openxmlformats.org/officeDocument/2006/relationships" xmlns:o="urn:schemas-microsoft-com:office:office" xmlns:v="urn:schemas-microsoft-com:vml" xmlns:w10="urn:schemas-microsoft-com:office:word" xmlns:a="http://schemas.openxmlformats.org/drawingml/2006/main" xmlns:pic="http://schemas.openxmlformats.org/drawingml/2006/picture" xmlns:wp="http://schemas.openxmlformats.org/drawingml/2006/wordprocessingDrawing">
   <w:body>
-    <w:bookmarkStart w:id="19" w:name="microsoft-form-question-draft"/>
+    <w:bookmarkStart w:id="20" w:name="microsoft-form-question-draft"/>
     <w:p>
       <w:pPr>
         <w:pStyle w:val="Heading1"/>
@@ -74,7 +74,7 @@
       </w:r>
     </w:p>
     <w:bookmarkEnd w:id="10"/>
-    <w:bookmarkStart w:id="14" w:name="questions"/>
+    <w:bookmarkStart w:id="15" w:name="questions"/>
     <w:p>
       <w:pPr>
         <w:pStyle w:val="Heading2"/>
@@ -159,6 +159,69 @@
         <w:rPr>
           <w:rStyle w:val="VerbatimChar"/>
         </w:rPr>
+        <w:t xml:space="preserve">Academic advisor</w:t>
+      </w:r>
+      <w:r>
+        <w:br/>
+      </w:r>
+      <w:r>
+        <w:rPr>
+          <w:rStyle w:val="VerbatimChar"/>
+        </w:rPr>
+        <w:t xml:space="preserve">Assessment query</w:t>
+      </w:r>
+      <w:r>
+        <w:br/>
+      </w:r>
+      <w:r>
+        <w:rPr>
+          <w:rStyle w:val="VerbatimChar"/>
+        </w:rPr>
+        <w:t xml:space="preserve">Attendance</w:t>
+      </w:r>
+      <w:r>
+        <w:br/>
+      </w:r>
+      <w:r>
+        <w:rPr>
+          <w:rStyle w:val="VerbatimChar"/>
+        </w:rPr>
+        <w:t xml:space="preserve">Extension</w:t>
+      </w:r>
+      <w:r>
+        <w:br/>
+      </w:r>
+      <w:r>
+        <w:rPr>
+          <w:rStyle w:val="VerbatimChar"/>
+        </w:rPr>
+        <w:t xml:space="preserve">Fees / finance</w:t>
+      </w:r>
+      <w:r>
+        <w:br/>
+      </w:r>
+      <w:r>
+        <w:rPr>
+          <w:rStyle w:val="VerbatimChar"/>
+        </w:rPr>
+        <w:t xml:space="preserve">IT / systems access</w:t>
+      </w:r>
+      <w:r>
+        <w:br/>
+      </w:r>
+      <w:r>
+        <w:rPr>
+          <w:rStyle w:val="VerbatimChar"/>
+        </w:rPr>
+        <w:t xml:space="preserve">Mitigating circumstances</w:t>
+      </w:r>
+      <w:r>
+        <w:br/>
+      </w:r>
+      <w:r>
+        <w:rPr>
+          <w:rStyle w:val="VerbatimChar"/>
+        </w:rPr>
         <w:t xml:space="preserve">Module enquiry</w:t>
       </w:r>
       <w:r>
@@ -168,70 +231,7 @@
         <w:rPr>
           <w:rStyle w:val="VerbatimChar"/>
         </w:rPr>
-        <w:t xml:space="preserve">Academic advisor</w:t>
-      </w:r>
-      <w:r>
-        <w:br/>
-      </w:r>
-      <w:r>
-        <w:rPr>
-          <w:rStyle w:val="VerbatimChar"/>
-        </w:rPr>
-        <w:t xml:space="preserve">Assessment query</w:t>
-      </w:r>
-      <w:r>
-        <w:br/>
-      </w:r>
-      <w:r>
-        <w:rPr>
-          <w:rStyle w:val="VerbatimChar"/>
-        </w:rPr>
-        <w:t xml:space="preserve">Extension</w:t>
-      </w:r>
-      <w:r>
-        <w:br/>
-      </w:r>
-      <w:r>
-        <w:rPr>
-          <w:rStyle w:val="VerbatimChar"/>
-        </w:rPr>
-        <w:t xml:space="preserve">Mitigating circumstances</w:t>
-      </w:r>
-      <w:r>
-        <w:br/>
-      </w:r>
-      <w:r>
-        <w:rPr>
-          <w:rStyle w:val="VerbatimChar"/>
-        </w:rPr>
-        <w:t xml:space="preserve">Attendance</w:t>
-      </w:r>
-      <w:r>
-        <w:br/>
-      </w:r>
-      <w:r>
-        <w:rPr>
-          <w:rStyle w:val="VerbatimChar"/>
-        </w:rPr>
         <w:t xml:space="preserve">Timetable</w:t>
-      </w:r>
-      <w:r>
-        <w:br/>
-      </w:r>
-      <w:r>
-        <w:rPr>
-          <w:rStyle w:val="VerbatimChar"/>
-        </w:rPr>
-        <w:t xml:space="preserve">IT / systems access</w:t>
-      </w:r>
-      <w:r>
-        <w:br/>
-      </w:r>
-      <w:r>
-        <w:rPr>
-          <w:rStyle w:val="VerbatimChar"/>
-        </w:rPr>
-        <w:t xml:space="preserve">Fees / finance</w:t>
       </w:r>
       <w:r>
         <w:br/>
@@ -413,8 +413,184 @@
       </w:r>
     </w:p>
     <w:bookmarkEnd w:id="13"/>
+    <w:bookmarkStart w:id="14" w:name="attach-files-or-screenshots"/>
+    <w:p>
+      <w:pPr>
+        <w:pStyle w:val="Heading3"/>
+      </w:pPr>
+      <w:r>
+        <w:t xml:space="preserve">4. Attach files or screenshots</w:t>
+      </w:r>
+    </w:p>
+    <w:p>
+      <w:pPr>
+        <w:pStyle w:val="Compact"/>
+        <w:numPr>
+          <w:ilvl w:val="0"/>
+          <w:numId w:val="1007"/>
+        </w:numPr>
+      </w:pPr>
+      <w:r>
+        <w:t xml:space="preserve">Type: file upload</w:t>
+      </w:r>
+    </w:p>
+    <w:p>
+      <w:pPr>
+        <w:pStyle w:val="Compact"/>
+        <w:numPr>
+          <w:ilvl w:val="0"/>
+          <w:numId w:val="1007"/>
+        </w:numPr>
+      </w:pPr>
+      <w:r>
+        <w:t xml:space="preserve">Required: no</w:t>
+      </w:r>
+    </w:p>
+    <w:p>
+      <w:pPr>
+        <w:pStyle w:val="Compact"/>
+        <w:numPr>
+          <w:ilvl w:val="0"/>
+          <w:numId w:val="1007"/>
+        </w:numPr>
+      </w:pPr>
+      <w:r>
+        <w:t xml:space="preserve">Prompt:</w:t>
+      </w:r>
+    </w:p>
+    <w:p>
+      <w:pPr>
+        <w:pStyle w:val="FirstParagraph"/>
+      </w:pPr>
+      <w:r>
+        <w:rPr>
+          <w:rStyle w:val="VerbatimChar"/>
+        </w:rPr>
+        <w:t xml:space="preserve">Attach files or screenshots if relevant</w:t>
+      </w:r>
+    </w:p>
+    <w:p>
+      <w:pPr>
+        <w:pStyle w:val="Compact"/>
+        <w:numPr>
+          <w:ilvl w:val="0"/>
+          <w:numId w:val="1008"/>
+        </w:numPr>
+      </w:pPr>
+      <w:r>
+        <w:t xml:space="preserve">Help text:</w:t>
+      </w:r>
+    </w:p>
+    <w:p>
+      <w:pPr>
+        <w:pStyle w:val="FirstParagraph"/>
+      </w:pPr>
+      <w:r>
+        <w:rPr>
+          <w:rStyle w:val="VerbatimChar"/>
+        </w:rPr>
+        <w:t xml:space="preserve">Upload screenshots, PDFs, or short supporting documents that help staff understand the issue. Do not upload unnecessary sensitive personal or medical information; use any formal university evidence process where required.</w:t>
+      </w:r>
+    </w:p>
+    <w:p>
+      <w:pPr>
+        <w:pStyle w:val="Compact"/>
+        <w:numPr>
+          <w:ilvl w:val="0"/>
+          <w:numId w:val="1009"/>
+        </w:numPr>
+      </w:pPr>
+      <w:r>
+        <w:t xml:space="preserve">Recommended settings:</w:t>
+      </w:r>
+    </w:p>
+    <w:p>
+      <w:pPr>
+        <w:pStyle w:val="Compact"/>
+        <w:numPr>
+          <w:ilvl w:val="1"/>
+          <w:numId w:val="1010"/>
+        </w:numPr>
+      </w:pPr>
+      <w:r>
+        <w:t xml:space="preserve">Respondents: only people in the organisation</w:t>
+      </w:r>
+    </w:p>
+    <w:p>
+      <w:pPr>
+        <w:pStyle w:val="Compact"/>
+        <w:numPr>
+          <w:ilvl w:val="1"/>
+          <w:numId w:val="1010"/>
+        </w:numPr>
+      </w:pPr>
+      <w:r>
+        <w:t xml:space="preserve">Maximum number of files: 10</w:t>
+      </w:r>
+    </w:p>
+    <w:p>
+      <w:pPr>
+        <w:pStyle w:val="Compact"/>
+        <w:numPr>
+          <w:ilvl w:val="1"/>
+          <w:numId w:val="1010"/>
+        </w:numPr>
+      </w:pPr>
+      <w:r>
+        <w:t xml:space="preserve">Single file size limit: 10 MB</w:t>
+      </w:r>
+    </w:p>
+    <w:p>
+      <w:pPr>
+        <w:pStyle w:val="Compact"/>
+        <w:numPr>
+          <w:ilvl w:val="1"/>
+          <w:numId w:val="1010"/>
+        </w:numPr>
+      </w:pPr>
+      <w:r>
+        <w:t xml:space="preserve">File types: Image, PDF, Word</w:t>
+      </w:r>
+    </w:p>
+    <w:p>
+      <w:pPr>
+        <w:pStyle w:val="Compact"/>
+        <w:numPr>
+          <w:ilvl w:val="0"/>
+          <w:numId w:val="1009"/>
+        </w:numPr>
+      </w:pPr>
+      <w:r>
+        <w:t xml:space="preserve">Storage note:</w:t>
+      </w:r>
+    </w:p>
+    <w:p>
+      <w:pPr>
+        <w:pStyle w:val="Compact"/>
+        <w:numPr>
+          <w:ilvl w:val="1"/>
+          <w:numId w:val="1011"/>
+        </w:numPr>
+      </w:pPr>
+      <w:r>
+        <w:t xml:space="preserve">For production, make this a group-owned form so uploads live in the group SharePoint site rather than an individual’s OneDrive.</w:t>
+      </w:r>
+    </w:p>
+    <w:p>
+      <w:pPr>
+        <w:pStyle w:val="Compact"/>
+        <w:numPr>
+          <w:ilvl w:val="1"/>
+          <w:numId w:val="1011"/>
+        </w:numPr>
+      </w:pPr>
+      <w:r>
+        <w:t xml:space="preserve">Staff emails should include links to uploaded files or the enquiry evidence folder, not copies of the files as email attachments.</w:t>
+      </w:r>
+    </w:p>
     <w:bookmarkEnd w:id="14"/>
-    <w:bookmarkStart w:id="15" w:name="optional-checkpoint-field"/>
+    <w:bookmarkEnd w:id="15"/>
+    <w:bookmarkStart w:id="16" w:name="optional-checkpoint-field"/>
     <w:p>
       <w:pPr>
         <w:pStyle w:val="Heading2"/>
@@ -436,7 +612,7 @@
         <w:pStyle w:val="Compact"/>
         <w:numPr>
           <w:ilvl w:val="0"/>
-          <w:numId w:val="1007"/>
+          <w:numId w:val="1012"/>
         </w:numPr>
       </w:pPr>
       <w:r>
@@ -448,7 +624,7 @@
         <w:pStyle w:val="Compact"/>
         <w:numPr>
           <w:ilvl w:val="0"/>
-          <w:numId w:val="1007"/>
+          <w:numId w:val="1012"/>
         </w:numPr>
       </w:pPr>
       <w:r>
@@ -468,7 +644,7 @@
         <w:pStyle w:val="Compact"/>
         <w:numPr>
           <w:ilvl w:val="0"/>
-          <w:numId w:val="1008"/>
+          <w:numId w:val="1013"/>
         </w:numPr>
       </w:pPr>
       <w:r>
@@ -492,15 +668,15 @@
         <w:pStyle w:val="Compact"/>
         <w:numPr>
           <w:ilvl w:val="0"/>
-          <w:numId w:val="1008"/>
+          <w:numId w:val="1013"/>
         </w:numPr>
       </w:pPr>
       <w:r>
         <w:t xml:space="preserve">Do not add multiple extra study-detail questions unless testing shows they are needed.</w:t>
       </w:r>
     </w:p>
-    <w:bookmarkEnd w:id="15"/>
-    <w:bookmarkStart w:id="16" w:name="branching-map"/>
+    <w:bookmarkEnd w:id="16"/>
+    <w:bookmarkStart w:id="17" w:name="branching-map"/>
     <w:p>
       <w:pPr>
         <w:pStyle w:val="Heading2"/>
@@ -514,7 +690,7 @@
         <w:pStyle w:val="Compact"/>
         <w:numPr>
           <w:ilvl w:val="0"/>
-          <w:numId w:val="1009"/>
+          <w:numId w:val="1014"/>
         </w:numPr>
       </w:pPr>
       <w:r>
@@ -554,6 +730,18 @@
         <w:t xml:space="preserve">Message</w:t>
       </w:r>
       <w:r>
+        <w:t xml:space="preserve">, then</w:t>
+      </w:r>
+      <w:r>
+        <w:t xml:space="preserve"> </w:t>
+      </w:r>
+      <w:r>
+        <w:rPr>
+          <w:rStyle w:val="VerbatimChar"/>
+        </w:rPr>
+        <w:t xml:space="preserve">Attach files or screenshots</w:t>
+      </w:r>
+      <w:r>
         <w:t xml:space="preserve">.</w:t>
       </w:r>
     </w:p>
@@ -562,7 +750,7 @@
         <w:pStyle w:val="Compact"/>
         <w:numPr>
           <w:ilvl w:val="0"/>
-          <w:numId w:val="1009"/>
+          <w:numId w:val="1014"/>
         </w:numPr>
       </w:pPr>
       <w:r>
@@ -593,11 +781,23 @@
         <w:t xml:space="preserve">Message</w:t>
       </w:r>
       <w:r>
+        <w:t xml:space="preserve">, then</w:t>
+      </w:r>
+      <w:r>
+        <w:t xml:space="preserve"> </w:t>
+      </w:r>
+      <w:r>
+        <w:rPr>
+          <w:rStyle w:val="VerbatimChar"/>
+        </w:rPr>
+        <w:t xml:space="preserve">Attach files or screenshots</w:t>
+      </w:r>
+      <w:r>
         <w:t xml:space="preserve">.</w:t>
       </w:r>
     </w:p>
-    <w:bookmarkEnd w:id="16"/>
-    <w:bookmarkStart w:id="17" w:name="thank-you-message"/>
+    <w:bookmarkEnd w:id="17"/>
+    <w:bookmarkStart w:id="18" w:name="thank-you-message"/>
     <w:p>
       <w:pPr>
         <w:pStyle w:val="Heading2"/>
@@ -617,8 +817,8 @@
         <w:t xml:space="preserve">Thank you. Your enquiry has been submitted. You will receive an acknowledgement email with a reference number.</w:t>
       </w:r>
     </w:p>
-    <w:bookmarkEnd w:id="17"/>
-    <w:bookmarkStart w:id="18" w:name="identity-note"/>
+    <w:bookmarkEnd w:id="18"/>
+    <w:bookmarkStart w:id="19" w:name="identity-note"/>
     <w:p>
       <w:pPr>
         <w:pStyle w:val="Heading2"/>
@@ -632,7 +832,7 @@
         <w:pStyle w:val="Compact"/>
         <w:numPr>
           <w:ilvl w:val="0"/>
-          <w:numId w:val="1010"/>
+          <w:numId w:val="1015"/>
         </w:numPr>
       </w:pPr>
       <w:r>
@@ -659,7 +859,7 @@
         <w:pStyle w:val="Compact"/>
         <w:numPr>
           <w:ilvl w:val="0"/>
-          <w:numId w:val="1010"/>
+          <w:numId w:val="1015"/>
         </w:numPr>
       </w:pPr>
       <w:r>
@@ -686,7 +886,7 @@
         <w:pStyle w:val="Compact"/>
         <w:numPr>
           <w:ilvl w:val="0"/>
-          <w:numId w:val="1010"/>
+          <w:numId w:val="1015"/>
         </w:numPr>
       </w:pPr>
       <w:r>
@@ -698,7 +898,7 @@
         <w:pStyle w:val="Compact"/>
         <w:numPr>
           <w:ilvl w:val="0"/>
-          <w:numId w:val="1010"/>
+          <w:numId w:val="1015"/>
         </w:numPr>
       </w:pPr>
       <w:r>
@@ -710,15 +910,15 @@
         <w:pStyle w:val="Compact"/>
         <w:numPr>
           <w:ilvl w:val="0"/>
-          <w:numId w:val="1010"/>
+          <w:numId w:val="1015"/>
         </w:numPr>
       </w:pPr>
       <w:r>
         <w:t xml:space="preserve">If your tenant exposes username directly, you can use it as well, but email is the safer version 1 key.</w:t>
       </w:r>
     </w:p>
-    <w:bookmarkEnd w:id="18"/>
     <w:bookmarkEnd w:id="19"/>
+    <w:bookmarkEnd w:id="20"/>
     <w:sectPr>
       <w:footnotePr>
         <w:numRestart w:val="eachSect"/>
@@ -963,6 +1163,21 @@
     <w:abstractNumId w:val="991"/>
   </w:num>
   <w:num w:numId="1010">
+    <w:abstractNumId w:val="991"/>
+  </w:num>
+  <w:num w:numId="1011">
+    <w:abstractNumId w:val="991"/>
+  </w:num>
+  <w:num w:numId="1012">
+    <w:abstractNumId w:val="991"/>
+  </w:num>
+  <w:num w:numId="1013">
+    <w:abstractNumId w:val="991"/>
+  </w:num>
+  <w:num w:numId="1014">
+    <w:abstractNumId w:val="991"/>
+  </w:num>
+  <w:num w:numId="1015">
     <w:abstractNumId w:val="991"/>
   </w:num>
 </w:numbering>

</xml_diff>